<commit_message>
Regulatory package v1.0.1 regenerated from the clean tree at aa92eff: M&S report, anticipated FDA questions, SAP text, traceability (2,339 values: 656 regulatory + 1,683 deck_ko), SHA-256 manifest (407 files incl. the results deck and config/literature_precedents.yaml), reviewer README and release notes
Co-Authored-By: Claude Opus 5.5 <noreply@anthropic.com>
Claude-Session: https://claude.ai/code/session_01VcVRPzFxTqkW2KRC1Wkk1r
</commit_message>
<xml_diff>
--- a/regulatory/MS_report.docx
+++ b/regulatory/MS_report.docx
@@ -312,7 +312,7 @@
               <w:jc w:val="left"/>
             </w:pPr>
             <w:r>
-              <w:t xml:space="preserve">2026-09-29 05:11</w:t>
+              <w:t xml:space="preserve">2026-09-29 05:12</w:t>
             </w:r>
           </w:p>
         </w:tc>
@@ -338,7 +338,7 @@
               <w:jc w:val="left"/>
             </w:pPr>
             <w:r>
-              <w:t xml:space="preserve">461042c5b97e261a3ef1399d4a26123bfa21afa0</w:t>
+              <w:t xml:space="preserve">aa92eff2e8ac96e4d93eb68295602aeaa4c5e2ba</w:t>
             </w:r>
           </w:p>
         </w:tc>

</xml_diff>

<commit_message>
Regulatory package: regenerate with the final core deck v1.1 (1,273 printed values as document deck_core_ko; 3,612 traced values, 503 files in the manifest)
Co-Authored-By: Claude Opus 5.5 <noreply@anthropic.com>
Claude-Session: https://claude.ai/code/session_01VcVRPzFxTqkW2KRC1Wkk1r
</commit_message>
<xml_diff>
--- a/regulatory/MS_report.docx
+++ b/regulatory/MS_report.docx
@@ -312,7 +312,7 @@
               <w:jc w:val="left"/>
             </w:pPr>
             <w:r>
-              <w:t xml:space="preserve">2026-09-29 05:12</w:t>
+              <w:t xml:space="preserve">2026-09-29 09:07</w:t>
             </w:r>
           </w:p>
         </w:tc>
@@ -338,7 +338,7 @@
               <w:jc w:val="left"/>
             </w:pPr>
             <w:r>
-              <w:t xml:space="preserve">aa92eff2e8ac96e4d93eb68295602aeaa4c5e2ba</w:t>
+              <w:t xml:space="preserve">8e5fd7a07e6d68b8aec934f33dd1f6791559c320</w:t>
             </w:r>
           </w:p>
         </w:tc>

</xml_diff>